<commit_message>
Updated the Static Analysis - Establish Settings Procedure tertiary document (omitted considerations section)
</commit_message>
<xml_diff>
--- a/source/reference_documents/tertiary_documents/implementation/Static Analysis/establish settings/Static Analysis - Establish Settings.docx
+++ b/source/reference_documents/tertiary_documents/implementation/Static Analysis/establish settings/Static Analysis - Establish Settings.docx
@@ -43,7 +43,7 @@
         <w:t xml:space="preserve">Version </w:t>
       </w:r>
       <w:r>
-        <w:t>2</w:t>
+        <w:t>3</w:t>
       </w:r>
     </w:p>
     <w:p>
@@ -60,7 +60,7 @@
         <w:rPr>
           <w:noProof/>
         </w:rPr>
-        <w:t>2/3/26 8:27 AM</w:t>
+        <w:t>2/3/26 12:49 PM</w:t>
       </w:r>
       <w:r>
         <w:fldChar w:fldCharType="end"/>
@@ -1739,6 +1739,308 @@
       </w:r>
       <w:r>
         <w:t>.</w:t>
+      </w:r>
+    </w:p>
+    <w:p>
+      <w:pPr>
+        <w:spacing w:after="0"/>
+        <w:jc w:val="left"/>
+        <w:rPr>
+          <w:sz w:val="40"/>
+          <w:szCs w:val="40"/>
+        </w:rPr>
+      </w:pPr>
+      <w:r>
+        <w:br w:type="page"/>
+      </w:r>
+    </w:p>
+    <w:p>
+      <w:pPr>
+        <w:pStyle w:val="Heading1"/>
+      </w:pPr>
+      <w:r>
+        <w:lastRenderedPageBreak/>
+        <w:t>Considerations</w:t>
+      </w:r>
+    </w:p>
+    <w:p>
+      <w:r>
+        <w:t xml:space="preserve">The following covers specific considerations </w:t>
+      </w:r>
+      <w:r>
+        <w:t>regarding applying the secure settings process to static analysis</w:t>
+      </w:r>
+      <w:r>
+        <w:t>.</w:t>
+      </w:r>
+      <w:r>
+        <w:t xml:space="preserve"> These will be addressed on an activity-by-activity basis.</w:t>
+      </w:r>
+    </w:p>
+    <w:p>
+      <w:pPr>
+        <w:pStyle w:val="Heading2"/>
+      </w:pPr>
+      <w:r>
+        <w:t>Identify Options</w:t>
+      </w:r>
+    </w:p>
+    <w:p>
+      <w:pPr>
+        <w:pStyle w:val="Heading3"/>
+        <w:rPr>
+          <w:color w:val="0070C0"/>
+        </w:rPr>
+      </w:pPr>
+      <w:r>
+        <w:rPr>
+          <w:color w:val="0070C0"/>
+        </w:rPr>
+        <w:t>Cybersecurity Relevant</w:t>
+      </w:r>
+    </w:p>
+    <w:p>
+      <w:r>
+        <w:t>Options</w:t>
+      </w:r>
+      <w:r>
+        <w:t xml:space="preserve"> should be chosen exclusively for their cybersecurity relevance</w:t>
+      </w:r>
+      <w:r>
+        <w:t>.</w:t>
+      </w:r>
+      <w:r>
+        <w:t xml:space="preserve"> It is presumed that non-cybersecurity static analysis will make use of options appropriate to their specific use cases.</w:t>
+      </w:r>
+    </w:p>
+    <w:p>
+      <w:pPr>
+        <w:pStyle w:val="Heading3"/>
+        <w:rPr>
+          <w:color w:val="0070C0"/>
+        </w:rPr>
+      </w:pPr>
+      <w:r>
+        <w:rPr>
+          <w:color w:val="0070C0"/>
+        </w:rPr>
+        <w:t>Released</w:t>
+      </w:r>
+    </w:p>
+    <w:p>
+      <w:r>
+        <w:t>Because of the nature of unreleased options, they should not be recommended for use</w:t>
+      </w:r>
+      <w:r>
+        <w:t>.</w:t>
+      </w:r>
+      <w:r>
+        <w:t xml:space="preserve"> The goal is to provide high-quality, low false-positive issues.</w:t>
+      </w:r>
+    </w:p>
+    <w:p>
+      <w:pPr>
+        <w:pStyle w:val="Heading2"/>
+      </w:pPr>
+      <w:r>
+        <w:t>Categorize</w:t>
+      </w:r>
+      <w:r>
+        <w:t xml:space="preserve"> Options</w:t>
+      </w:r>
+    </w:p>
+    <w:p>
+      <w:pPr>
+        <w:pStyle w:val="Heading3"/>
+        <w:rPr>
+          <w:color w:val="0070C0"/>
+        </w:rPr>
+      </w:pPr>
+      <w:r>
+        <w:rPr>
+          <w:color w:val="0070C0"/>
+        </w:rPr>
+        <w:t>Practical</w:t>
+      </w:r>
+    </w:p>
+    <w:p>
+      <w:r>
+        <w:t xml:space="preserve">As noted in the </w:t>
+      </w:r>
+      <w:r>
+        <w:rPr>
+          <w:b/>
+          <w:bCs/>
+        </w:rPr>
+        <w:t>Secure Settings – Categorize Options Procedure</w:t>
+      </w:r>
+      <w:r>
+        <w:t>, categories should be both comprehensible and easy to adopt</w:t>
+      </w:r>
+      <w:r>
+        <w:t>.</w:t>
+      </w:r>
+      <w:r>
+        <w:t xml:space="preserve"> It is recommended that a </w:t>
+      </w:r>
+      <w:r>
+        <w:rPr>
+          <w:b/>
+          <w:bCs/>
+        </w:rPr>
+        <w:t>must-do</w:t>
+      </w:r>
+      <w:r>
+        <w:t xml:space="preserve"> / </w:t>
+      </w:r>
+      <w:r>
+        <w:rPr>
+          <w:b/>
+          <w:bCs/>
+        </w:rPr>
+        <w:t>may-do</w:t>
+      </w:r>
+      <w:r>
+        <w:t xml:space="preserve"> approach be used.</w:t>
+      </w:r>
+    </w:p>
+    <w:p>
+      <w:pPr>
+        <w:pStyle w:val="Heading3"/>
+        <w:rPr>
+          <w:color w:val="0070C0"/>
+        </w:rPr>
+      </w:pPr>
+      <w:r>
+        <w:rPr>
+          <w:color w:val="0070C0"/>
+        </w:rPr>
+        <w:t>Consistent Categorization</w:t>
+      </w:r>
+    </w:p>
+    <w:p>
+      <w:r>
+        <w:t>It is important to apply option categorization consistently and without bias</w:t>
+      </w:r>
+      <w:r>
+        <w:t>.</w:t>
+      </w:r>
+      <w:r>
+        <w:t xml:space="preserve"> A consistent approach to categorization will lead to positive cybersecurity outcomes.</w:t>
+      </w:r>
+    </w:p>
+    <w:p>
+      <w:pPr>
+        <w:pStyle w:val="Heading2"/>
+      </w:pPr>
+      <w:r>
+        <w:t>Select</w:t>
+      </w:r>
+      <w:r>
+        <w:t xml:space="preserve"> Options</w:t>
+      </w:r>
+    </w:p>
+    <w:p>
+      <w:pPr>
+        <w:pStyle w:val="Heading3"/>
+        <w:rPr>
+          <w:color w:val="0070C0"/>
+        </w:rPr>
+      </w:pPr>
+      <w:r>
+        <w:rPr>
+          <w:color w:val="0070C0"/>
+        </w:rPr>
+        <w:t>Maturity</w:t>
+      </w:r>
+    </w:p>
+    <w:p>
+      <w:r>
+        <w:t>When selecting identified options for application, the maturity of the element under consideration and the use static analysis process in general should be considered</w:t>
+      </w:r>
+      <w:r>
+        <w:t>.</w:t>
+      </w:r>
+    </w:p>
+    <w:p>
+      <w:pPr>
+        <w:pStyle w:val="Heading3"/>
+        <w:rPr>
+          <w:color w:val="0070C0"/>
+        </w:rPr>
+      </w:pPr>
+      <w:r>
+        <w:rPr>
+          <w:color w:val="0070C0"/>
+        </w:rPr>
+        <w:t>Impact</w:t>
+      </w:r>
+    </w:p>
+    <w:p>
+      <w:r>
+        <w:t>Prioritize high cybersecurity impact options. More can be added later.</w:t>
+      </w:r>
+    </w:p>
+    <w:p>
+      <w:pPr>
+        <w:pStyle w:val="Heading2"/>
+      </w:pPr>
+      <w:r>
+        <w:lastRenderedPageBreak/>
+        <w:t>Apply</w:t>
+      </w:r>
+      <w:r>
+        <w:t xml:space="preserve"> Options</w:t>
+      </w:r>
+    </w:p>
+    <w:p>
+      <w:pPr>
+        <w:pStyle w:val="Heading3"/>
+        <w:rPr>
+          <w:color w:val="0070C0"/>
+        </w:rPr>
+      </w:pPr>
+      <w:r>
+        <w:rPr>
+          <w:color w:val="0070C0"/>
+        </w:rPr>
+        <w:t>Option Interaction</w:t>
+      </w:r>
+    </w:p>
+    <w:p>
+      <w:r>
+        <w:t>Options are not always isolated from each other</w:t>
+      </w:r>
+      <w:r>
+        <w:t>.</w:t>
+      </w:r>
+      <w:r>
+        <w:t xml:space="preserve"> This is especially true when dealing with compiler options. Verify that the selected options do not conflict with each other, and that they only operate within the desired scope.</w:t>
+      </w:r>
+    </w:p>
+    <w:p>
+      <w:pPr>
+        <w:pStyle w:val="Heading3"/>
+        <w:rPr>
+          <w:color w:val="0070C0"/>
+        </w:rPr>
+      </w:pPr>
+      <w:r>
+        <w:rPr>
+          <w:color w:val="0070C0"/>
+        </w:rPr>
+        <w:t>Execution Impact</w:t>
+      </w:r>
+    </w:p>
+    <w:p>
+      <w:r>
+        <w:t>Static analysis is a resource intensive activity</w:t>
+      </w:r>
+      <w:r>
+        <w:t>.</w:t>
+      </w:r>
+      <w:r>
+        <w:t xml:space="preserve"> Ensure that sufficient resources (time, memory, storage) are available.</w:t>
       </w:r>
     </w:p>
     <w:p>

</xml_diff>

<commit_message>
updated the Static Analysis Establish Settings and Perform Analysis Procedure documents (added tooling note)
</commit_message>
<xml_diff>
--- a/source/reference_documents/tertiary_documents/implementation/Static Analysis/establish settings/Static Analysis - Establish Settings.docx
+++ b/source/reference_documents/tertiary_documents/implementation/Static Analysis/establish settings/Static Analysis - Establish Settings.docx
@@ -43,7 +43,7 @@
         <w:t xml:space="preserve">Version </w:t>
       </w:r>
       <w:r>
-        <w:t>3</w:t>
+        <w:t>4</w:t>
       </w:r>
     </w:p>
     <w:p>
@@ -60,7 +60,7 @@
         <w:rPr>
           <w:noProof/>
         </w:rPr>
-        <w:t>2/3/26 12:49 PM</w:t>
+        <w:t>2/16/26 8:50 AM</w:t>
       </w:r>
       <w:r>
         <w:fldChar w:fldCharType="end"/>
@@ -1843,10 +1843,7 @@
         <w:pStyle w:val="Heading2"/>
       </w:pPr>
       <w:r>
-        <w:t>Categorize</w:t>
-      </w:r>
-      <w:r>
-        <w:t xml:space="preserve"> Options</w:t>
+        <w:t>Categorize Options</w:t>
       </w:r>
     </w:p>
     <w:p>
@@ -1934,10 +1931,7 @@
         <w:pStyle w:val="Heading2"/>
       </w:pPr>
       <w:r>
-        <w:t>Select</w:t>
-      </w:r>
-      <w:r>
-        <w:t xml:space="preserve"> Options</w:t>
+        <w:t>Select Options</w:t>
       </w:r>
     </w:p>
     <w:p>
@@ -1987,10 +1981,7 @@
       </w:pPr>
       <w:r>
         <w:lastRenderedPageBreak/>
-        <w:t>Apply</w:t>
-      </w:r>
-      <w:r>
-        <w:t xml:space="preserve"> Options</w:t>
+        <w:t>Apply Options</w:t>
       </w:r>
     </w:p>
     <w:p>
@@ -2043,6 +2034,24 @@
         <w:t xml:space="preserve"> Ensure that sufficient resources (time, memory, storage) are available.</w:t>
       </w:r>
     </w:p>
+    <w:p>
+      <w:pPr>
+        <w:pStyle w:val="Note"/>
+      </w:pPr>
+      <w:r>
+        <w:rPr>
+          <w:b/>
+          <w:bCs/>
+          <w:color w:val="0070C0"/>
+        </w:rPr>
+        <w:t>Note:</w:t>
+      </w:r>
+      <w:r>
+        <w:tab/>
+        <w:t>It is recommended that when using non-static analysis tools for cybersecurity-specific static analysis within the build system that they be run separately with only cybersecurity-relevant settings in order to minimize the work required to perform the triage.</w:t>
+      </w:r>
+    </w:p>
+    <w:p/>
     <w:p>
       <w:r>
         <w:br w:type="page"/>

</xml_diff>